<commit_message>
Customer install package: guide 2.1 reissued to the 3 Oct kit, zip built from a commit
The 2 Oct zip was never uploaded and no longer matched the kit: the 3 Oct security work changed
how the administrator is made and added db files 19-21, and guide Rev 2.1 still gave the old
administrator steps. Guide reissued as 2.1 (5 Oct) by in-place XML edit, contents re-paged
against the rendered PDF. package-customer-install.sh builds the zip from a commit under the
name the guide gives, with only the current guide revision and no secret-shaped files, and
prints the upload rather than running it. New regression (27 checks, four mutations red);
the agreement test now finds desktop build scripts instead of naming them.

Co-Authored-By: Claude Opus 5.5 <noreply@anthropic.com>
Claude-Session: https://claude.ai/code/session_01DmF5BU5HncUk9eoV6tcALT
</commit_message>
<xml_diff>
--- a/customer-install/SL-DG-0001 Deployment and Setup Guide v2.1.docx
+++ b/customer-install/SL-DG-0001 Deployment and Setup Guide v2.1.docx
@@ -367,7 +367,7 @@
                 <w:sz w:val="19"/>
                 <w:szCs w:val="19"/>
               </w:rPr>
-              <w:t xml:space="preserve">2 October 2026</w:t>
+              <w:t xml:space="preserve">5 October 2026</w:t>
             </w:r>
           </w:p>
         </w:tc>
@@ -792,7 +792,7 @@
                 <w:sz w:val="19"/>
                 <w:szCs w:val="19"/>
               </w:rPr>
-              <w:t xml:space="preserve">2 Oct 2026</w:t>
+              <w:t xml:space="preserve">5 Oct 2026</w:t>
             </w:r>
           </w:p>
         </w:tc>
@@ -825,7 +825,7 @@
                 <w:sz w:val="19"/>
                 <w:szCs w:val="19"/>
               </w:rPr>
-              <w:t xml:space="preserve">Released. Everything since 2.0, which is the revision customers hold. Aligned with SL-EULA-0004 (one acceptance screen on first launch; a customer-hosted install holds no project data, accounts, sign-in events or AI requests at Safety Lab). New section 4.5, the all-in-one option: the database, the sign-in service, the API, the live-update channel and the AI service on one computer the customer owns, installed by one script that needs only Docker, written step by step. The setup file: the install hands every user one file that configures the desktop, loads the license and trusts the server's certificate in one click; no user installs a certificate and IT needs no certificate authority. Section 3 says where every piece comes from, with the download address of the install package. Section 5.3 points at the setup file. Sections 7.2 and 7.3 rewritten for the two-part egress listing (addresses that carry project data and addresses that do not). Section 4.2 documents ALLOWED_ORIGINS; section 6.2 says to create the Anthropic key inside a Workspace. Section 2 names the subprocessor list and the incident process. The install kit gained the sign-up trigger and the chain-check wrappers; an install built from an earlier kit must apply those files.</w:t>
+              <w:t xml:space="preserve">Released. Everything since 2.0, which is the revision customers hold. Aligned with SL-EULA-0004 (one acceptance screen on first launch; a customer-hosted install holds no project data, accounts, sign-in events or AI requests at Safety Lab). New section 4.5, the all-in-one option: the database, the sign-in service, the API, the live-update channel and the AI service on one computer the customer owns, installed by one script that needs only Docker, written step by step. The setup file: the install hands every user one file that configures the desktop, loads the license and trusts the server's certificate in one click; no user installs a certificate and IT needs no certificate authority. Section 3 says where every piece comes from, with the download address of the install package. Section 5.3 points at the setup file. Sections 7.2 and 7.3 rewritten for the two-part egress listing (addresses that carry project data and addresses that do not). Section 4.2 documents ALLOWED_ORIGINS; section 6.2 says to create the Anthropic key inside a Workspace. Section 2 names the subprocessor list and the incident process. Setting up the administrator follows the kit of 3 October: on a Supabase project of your own you create and confirm your account before naming it administrator (section 4.1); the all-in-one script creates the administrator account itself, asks for an optional mail server, and without one the administrator adds each user with add-user.sh (section 4.5). The install kit gained the sign-up trigger, the chain-check wrappers, private live-update channels, hardened access rules and lighter version history; an install built from an earlier kit must apply those files, in their numbered order.</w:t>
             </w:r>
           </w:p>
         </w:tc>
@@ -1212,7 +1212,7 @@
           <w:sz w:val="19"/>
           <w:szCs w:val="19"/>
         </w:rPr>
-        <w:t xml:space="preserve">	8</w:t>
+        <w:t xml:space="preserve">	9</w:t>
       </w:r>
     </w:p>
     <w:p>
@@ -1241,7 +1241,7 @@
           <w:sz w:val="19"/>
           <w:szCs w:val="19"/>
         </w:rPr>
-        <w:t xml:space="preserve">	10</w:t>
+        <w:t xml:space="preserve">	11</w:t>
       </w:r>
     </w:p>
     <w:p>
@@ -1270,7 +1270,7 @@
           <w:sz w:val="19"/>
           <w:szCs w:val="19"/>
         </w:rPr>
-        <w:t xml:space="preserve">	10</w:t>
+        <w:t xml:space="preserve">	11</w:t>
       </w:r>
     </w:p>
     <w:p>
@@ -1299,7 +1299,7 @@
           <w:sz w:val="19"/>
           <w:szCs w:val="19"/>
         </w:rPr>
-        <w:t xml:space="preserve">	10</w:t>
+        <w:t xml:space="preserve">	11</w:t>
       </w:r>
     </w:p>
     <w:p>
@@ -1328,7 +1328,7 @@
           <w:sz w:val="19"/>
           <w:szCs w:val="19"/>
         </w:rPr>
-        <w:t xml:space="preserve">	11</w:t>
+        <w:t xml:space="preserve">	12</w:t>
       </w:r>
     </w:p>
     <w:p>
@@ -1357,7 +1357,7 @@
           <w:sz w:val="19"/>
           <w:szCs w:val="19"/>
         </w:rPr>
-        <w:t xml:space="preserve">	11</w:t>
+        <w:t xml:space="preserve">	12</w:t>
       </w:r>
     </w:p>
     <w:p>
@@ -1386,7 +1386,7 @@
           <w:sz w:val="19"/>
           <w:szCs w:val="19"/>
         </w:rPr>
-        <w:t xml:space="preserve">	11</w:t>
+        <w:t xml:space="preserve">	13</w:t>
       </w:r>
     </w:p>
     <w:p>
@@ -1415,7 +1415,7 @@
           <w:sz w:val="19"/>
           <w:szCs w:val="19"/>
         </w:rPr>
-        <w:t xml:space="preserve">	13</w:t>
+        <w:t xml:space="preserve">	14</w:t>
       </w:r>
     </w:p>
     <w:p>
@@ -1444,7 +1444,7 @@
           <w:sz w:val="19"/>
           <w:szCs w:val="19"/>
         </w:rPr>
-        <w:t xml:space="preserve">	13</w:t>
+        <w:t xml:space="preserve">	14</w:t>
       </w:r>
     </w:p>
     <w:p>
@@ -1473,7 +1473,7 @@
           <w:sz w:val="19"/>
           <w:szCs w:val="19"/>
         </w:rPr>
-        <w:t xml:space="preserve">	13</w:t>
+        <w:t xml:space="preserve">	14</w:t>
       </w:r>
     </w:p>
     <w:p>
@@ -1502,7 +1502,7 @@
           <w:sz w:val="19"/>
           <w:szCs w:val="19"/>
         </w:rPr>
-        <w:t xml:space="preserve">	13</w:t>
+        <w:t xml:space="preserve">	14</w:t>
       </w:r>
     </w:p>
     <w:p>
@@ -1531,7 +1531,7 @@
           <w:sz w:val="19"/>
           <w:szCs w:val="19"/>
         </w:rPr>
-        <w:t xml:space="preserve">	14</w:t>
+        <w:t xml:space="preserve">	15</w:t>
       </w:r>
     </w:p>
     <w:p>
@@ -1560,7 +1560,7 @@
           <w:sz w:val="19"/>
           <w:szCs w:val="19"/>
         </w:rPr>
-        <w:t xml:space="preserve">	15</w:t>
+        <w:t xml:space="preserve">	16</w:t>
       </w:r>
     </w:p>
     <w:p>
@@ -1589,7 +1589,7 @@
           <w:sz w:val="19"/>
           <w:szCs w:val="19"/>
         </w:rPr>
-        <w:t xml:space="preserve">	15</w:t>
+        <w:t xml:space="preserve">	16</w:t>
       </w:r>
     </w:p>
     <w:p>
@@ -1618,7 +1618,7 @@
           <w:sz w:val="19"/>
           <w:szCs w:val="19"/>
         </w:rPr>
-        <w:t xml:space="preserve">	15</w:t>
+        <w:t xml:space="preserve">	16</w:t>
       </w:r>
     </w:p>
     <w:p>
@@ -1647,7 +1647,7 @@
           <w:sz w:val="19"/>
           <w:szCs w:val="19"/>
         </w:rPr>
-        <w:t xml:space="preserve">	15</w:t>
+        <w:t xml:space="preserve">	16</w:t>
       </w:r>
     </w:p>
     <w:p>
@@ -1676,7 +1676,7 @@
           <w:sz w:val="19"/>
           <w:szCs w:val="19"/>
         </w:rPr>
-        <w:t xml:space="preserve">	15</w:t>
+        <w:t xml:space="preserve">	16</w:t>
       </w:r>
     </w:p>
     <w:p>
@@ -2717,7 +2717,7 @@
           <w:sz w:val="21"/>
           <w:szCs w:val="21"/>
         </w:rPr>
-        <w:t xml:space="preserve">https://updates.safetylabaero.com/customer-install/SafetyLabAero-customer-install-2026-10-02.zip</w:t>
+        <w:t xml:space="preserve">https://updates.safetylabaero.com/customer-install/SafetyLabAero-customer-install-2026-10-05.zip</w:t>
       </w:r>
       <w:r>
         <w:rPr>
@@ -2941,7 +2941,7 @@
           <w:sz w:val="21"/>
           <w:szCs w:val="21"/>
         </w:rPr>
-        <w:t xml:space="preserve">Then make yourself an administrator (run in the Supabase SQL editor, or with psql):</w:t>
+        <w:t xml:space="preserve">Then make yourself an administrator. First create your account in the application with that address (point the application at this database as in section 4.3 or 5.3) and confirm it from the email it sends. Keep Confirm email switched on in your Supabase project’s Auth settings; it is on by default. Only then, in the Supabase SQL editor or with psql:</w:t>
       </w:r>
     </w:p>
     <w:p>
@@ -2974,7 +2974,7 @@
           <w:sz w:val="21"/>
           <w:szCs w:val="21"/>
         </w:rPr>
-        <w:t xml:space="preserve">Your database is ready. The install starts with an empty administrator list, you just added the first entry, and carries none of Safety Lab’s own settings. To confirm the database is healthy without opening the application, run the checker from the kit against the same connection string:</w:t>
+        <w:t xml:space="preserve">Do it in that order: the administrator role follows the address, so it must belong to an account whose address you have confirmed yourself. Your database is ready. The install starts with an empty administrator list, you just added the first entry, and carries none of Safety Lab’s own settings. To confirm the database is healthy without opening the application, run the checker from the kit against the same connection string:</w:t>
       </w:r>
     </w:p>
     <w:p>
@@ -3490,7 +3490,7 @@
           <w:sz w:val="21"/>
           <w:szCs w:val="21"/>
         </w:rPr>
-        <w:t xml:space="preserve">Open the application (web or desktop). On first run it asks for your license file; load it. Create your account and sign in. Then:</w:t>
+        <w:t xml:space="preserve">Open the application (web or desktop). On first run it asks for your license file; load it. Sign in with the account you made in section 4.1. Then:</w:t>
       </w:r>
     </w:p>
     <w:p>
@@ -4043,7 +4043,7 @@
           <w:sz w:val="21"/>
           <w:szCs w:val="21"/>
         </w:rPr>
-        <w:t xml:space="preserve"> pressing Enter after each: the server name from Part 1 step 4; press Enter twice at the certificate questions (unless IT gave you files); the AI key from step 5 (nothing shows while you type, which is normal); press Enter at the Workspace ID question unless Safety Lab told you otherwise.</w:t>
+        <w:t xml:space="preserve"> pressing Enter after each: the server name from Part 1 step 4; press Enter twice at the certificate questions (unless IT gave you files); the AI key from step 5 (nothing shows while you type, which is normal); press Enter at the Workspace ID question unless Safety Lab told you otherwise; the administrator’s email address (yours, if you look after this server); then your mail server’s name, port, user name, password and sender address if IT gave you those, or press Enter to skip if you have no mail server (Part 4 explains what that changes).</w:t>
       </w:r>
     </w:p>
     <w:p>
@@ -4073,7 +4073,7 @@
           <w:sz w:val="21"/>
           <w:szCs w:val="21"/>
         </w:rPr>
-        <w:t xml:space="preserve"> The first run downloads about 9 GB. You see the database files being applied one by one, then Checking the front door, then two lines that should both say 200, then Done and a short sheet.</w:t>
+        <w:t xml:space="preserve"> The first run downloads about 9 GB. You see the database files being applied one by one, then Checking the front door, then two lines that should both say 200, then Done and a short sheet. If this run created the administrator account, the last lines show its email and a temporary password. They are shown this once and saved nowhere, so write the password down now.</w:t>
       </w:r>
     </w:p>
     <w:p>
@@ -4245,16 +4245,16 @@
           <w:sz w:val="21"/>
           <w:szCs w:val="21"/>
         </w:rPr>
-        <w:t xml:space="preserve">Create your account</w:t>
-      </w:r>
-      <w:r>
-        <w:rPr>
-          <w:rFonts w:ascii="Calibri" w:cs="Calibri" w:eastAsia="Calibri" w:hAnsi="Calibri"/>
-          <w:color w:val="222222"/>
-          <w:sz w:val="21"/>
-          <w:szCs w:val="21"/>
-        </w:rPr>
-        <w:t xml:space="preserve"> with your work email and a password, and you are in.</w:t>
+        <w:t xml:space="preserve">Sign in.</w:t>
+      </w:r>
+      <w:r>
+        <w:rPr>
+          <w:rFonts w:ascii="Calibri" w:cs="Calibri" w:eastAsia="Calibri" w:hAnsi="Calibri"/>
+          <w:color w:val="222222"/>
+          <w:sz w:val="21"/>
+          <w:szCs w:val="21"/>
+        </w:rPr>
+        <w:t xml:space="preserve"> If your server has a mail server, click Create account, use your work email, and click the link in the email you receive. If it does not, your administrator creates your account and gives you a temporary password: sign in with it, then change it under Account, Change password.</w:t>
       </w:r>
     </w:p>
     <w:p>
@@ -4271,7 +4271,7 @@
           <w:sz w:val="23"/>
           <w:szCs w:val="23"/>
         </w:rPr>
-        <w:t xml:space="preserve">Part 4. Make yourself the administrator (once)</w:t>
+        <w:t xml:space="preserve">Part 4. The administrator account</w:t>
       </w:r>
     </w:p>
     <w:p>
@@ -4285,7 +4285,7 @@
           <w:sz w:val="21"/>
           <w:szCs w:val="21"/>
         </w:rPr>
-        <w:t xml:space="preserve">In the Ubuntu or Terminal window, go to the stack folder inside selfhost and run the one-line command shown under For the administrator only in WHAT-TO-TYPE-IN-THE-APP.txt, with your own email in it. It is the same platform_admins insert as section 4.1, run inside the database container.</w:t>
+        <w:t xml:space="preserve">The install script asks for the administrator’s email, creates that account itself and makes it the administrator, then prints its temporary password once at the end of the install (Part 2). Sign in with it and change it under Account, Change password. To add a user on a server with no mail server, run ./add-user.sh person@yourcompany.com in the selfhost folder and give them the password it prints. Why: without a mail server nobody can check that a person owns the address they type, and the application trusts that address for invitations, the administrator role and sign-off records, so open sign-up is off on such a server.</w:t>
       </w:r>
     </w:p>
     <w:p>

</xml_diff>

<commit_message>
Customer server by IP address; Docker installed by the script on Ubuntu (guide stays 2.1)
For Radia (no internal DNS name). install.sh classes the answer as an IPv4 address or a DNS name
and refuses anything else; the certificate SAN and the root's name limit follow it; a certificate
for a different identity is remade; Caddy answers no-name connections for an IP (default_sni,
proven necessary); the front-door probe uses --connect-to. On Ubuntu 22.04+ a missing Docker is
installed from Ubuntu's own packages and the script carries on under the docker group. Proven on
a full stack at a bare IP: both checks 200, setup file with the pin, a license signed to the IP
accepted by the AI service and others refused. New regression (49 checks, six mutations red).
README and SL-DG-0001 Rev 2.1 updated in place (history rows now 1.0, 2.0, 2.1).

Co-Authored-By: Claude Opus 5.5 <noreply@anthropic.com>
Claude-Session: https://claude.ai/code/session_01DmF5BU5HncUk9eoV6tcALT
</commit_message>
<xml_diff>
--- a/customer-install/SL-DG-0001 Deployment and Setup Guide v2.1.docx
+++ b/customer-install/SL-DG-0001 Deployment and Setup Guide v2.1.docx
@@ -759,107 +759,6 @@
                 <w:sz w:val="19"/>
                 <w:szCs w:val="19"/>
               </w:rPr>
-              <w:t xml:space="preserve">2.1</w:t>
-            </w:r>
-          </w:p>
-        </w:tc>
-        <w:tc>
-          <w:tcPr>
-            <w:tcW w:type="dxa" w:w="1300"/>
-            <w:tcBorders>
-              <w:top w:val="single" w:color="auto" w:sz="4"/>
-              <w:left w:val="single" w:color="auto" w:sz="4"/>
-              <w:bottom w:val="single" w:color="auto" w:sz="4"/>
-              <w:right w:val="single" w:color="auto" w:sz="4"/>
-            </w:tcBorders>
-            <w:tcMar>
-              <w:top w:type="dxa" w:w="60"/>
-              <w:left w:type="dxa" w:w="110"/>
-              <w:bottom w:type="dxa" w:w="60"/>
-              <w:right w:type="dxa" w:w="110"/>
-            </w:tcMar>
-          </w:tcPr>
-          <w:p>
-            <w:pPr>
-              <w:spacing w:after="0" w:line="260"/>
-            </w:pPr>
-            <w:r>
-              <w:rPr>
-                <w:rFonts w:ascii="Calibri" w:cs="Calibri" w:eastAsia="Calibri" w:hAnsi="Calibri"/>
-                <w:b w:val="false"/>
-                <w:bCs w:val="false"/>
-                <w:color w:val="222222"/>
-                <w:sz w:val="19"/>
-                <w:szCs w:val="19"/>
-              </w:rPr>
-              <w:t xml:space="preserve">5 Oct 2026</w:t>
-            </w:r>
-          </w:p>
-        </w:tc>
-        <w:tc>
-          <w:tcPr>
-            <w:tcW w:type="dxa" w:w="7360"/>
-            <w:tcBorders>
-              <w:top w:val="single" w:color="auto" w:sz="4"/>
-              <w:left w:val="single" w:color="auto" w:sz="4"/>
-              <w:bottom w:val="single" w:color="auto" w:sz="4"/>
-              <w:right w:val="single" w:color="auto" w:sz="4"/>
-            </w:tcBorders>
-            <w:tcMar>
-              <w:top w:type="dxa" w:w="60"/>
-              <w:left w:type="dxa" w:w="110"/>
-              <w:bottom w:type="dxa" w:w="60"/>
-              <w:right w:type="dxa" w:w="110"/>
-            </w:tcMar>
-          </w:tcPr>
-          <w:p>
-            <w:pPr>
-              <w:spacing w:after="0" w:line="260"/>
-            </w:pPr>
-            <w:r>
-              <w:rPr>
-                <w:rFonts w:ascii="Calibri" w:cs="Calibri" w:eastAsia="Calibri" w:hAnsi="Calibri"/>
-                <w:b w:val="false"/>
-                <w:bCs w:val="false"/>
-                <w:color w:val="222222"/>
-                <w:sz w:val="19"/>
-                <w:szCs w:val="19"/>
-              </w:rPr>
-              <w:t xml:space="preserve">Released. Everything since 2.0, which is the revision customers hold. Aligned with SL-EULA-0004 (one acceptance screen on first launch; a customer-hosted install holds no project data, accounts, sign-in events or AI requests at Safety Lab). New section 4.5, the all-in-one option: the database, the sign-in service, the API, the live-update channel and the AI service on one computer the customer owns, installed by one script that needs only Docker, written step by step. The setup file: the install hands every user one file that configures the desktop, loads the license and trusts the server's certificate in one click; no user installs a certificate and IT needs no certificate authority. Section 3 says where every piece comes from, with the download address of the install package. Section 5.3 points at the setup file. Sections 7.2 and 7.3 rewritten for the two-part egress listing (addresses that carry project data and addresses that do not). Section 4.2 documents ALLOWED_ORIGINS; section 6.2 says to create the Anthropic key inside a Workspace. Section 2 names the subprocessor list and the incident process. Setting up the administrator follows the kit of 3 October: on a Supabase project of your own you create and confirm your account before naming it administrator (section 4.1); the all-in-one script creates the administrator account itself, asks for an optional mail server, and without one the administrator adds each user with add-user.sh (section 4.5). The install kit gained the sign-up trigger, the chain-check wrappers, private live-update channels, hardened access rules and lighter version history; an install built from an earlier kit must apply those files, in their numbered order.</w:t>
-            </w:r>
-          </w:p>
-        </w:tc>
-      </w:tr>
-      <w:tr>
-        <w:tc>
-          <w:tcPr>
-            <w:tcW w:type="dxa" w:w="700"/>
-            <w:tcBorders>
-              <w:top w:val="single" w:color="auto" w:sz="4"/>
-              <w:left w:val="single" w:color="auto" w:sz="4"/>
-              <w:bottom w:val="single" w:color="auto" w:sz="4"/>
-              <w:right w:val="single" w:color="auto" w:sz="4"/>
-            </w:tcBorders>
-            <w:tcMar>
-              <w:top w:type="dxa" w:w="60"/>
-              <w:left w:type="dxa" w:w="110"/>
-              <w:bottom w:type="dxa" w:w="60"/>
-              <w:right w:type="dxa" w:w="110"/>
-            </w:tcMar>
-          </w:tcPr>
-          <w:p>
-            <w:pPr>
-              <w:spacing w:after="0" w:line="260"/>
-            </w:pPr>
-            <w:r>
-              <w:rPr>
-                <w:rFonts w:ascii="Calibri" w:cs="Calibri" w:eastAsia="Calibri" w:hAnsi="Calibri"/>
-                <w:b/>
-                <w:bCs/>
-                <w:color w:val="222222"/>
-                <w:sz w:val="19"/>
-                <w:szCs w:val="19"/>
-              </w:rPr>
               <w:t xml:space="preserve">2.0</w:t>
             </w:r>
           </w:p>
@@ -931,6 +830,107 @@
           </w:p>
         </w:tc>
       </w:tr>
+      <w:tr>
+        <w:tc>
+          <w:tcPr>
+            <w:tcW w:type="dxa" w:w="700"/>
+            <w:tcBorders>
+              <w:top w:val="single" w:color="auto" w:sz="4"/>
+              <w:left w:val="single" w:color="auto" w:sz="4"/>
+              <w:bottom w:val="single" w:color="auto" w:sz="4"/>
+              <w:right w:val="single" w:color="auto" w:sz="4"/>
+            </w:tcBorders>
+            <w:tcMar>
+              <w:top w:type="dxa" w:w="60"/>
+              <w:left w:type="dxa" w:w="110"/>
+              <w:bottom w:type="dxa" w:w="60"/>
+              <w:right w:type="dxa" w:w="110"/>
+            </w:tcMar>
+          </w:tcPr>
+          <w:p>
+            <w:pPr>
+              <w:spacing w:after="0" w:line="260"/>
+            </w:pPr>
+            <w:r>
+              <w:rPr>
+                <w:rFonts w:ascii="Calibri" w:cs="Calibri" w:eastAsia="Calibri" w:hAnsi="Calibri"/>
+                <w:b/>
+                <w:bCs/>
+                <w:color w:val="222222"/>
+                <w:sz w:val="19"/>
+                <w:szCs w:val="19"/>
+              </w:rPr>
+              <w:t xml:space="preserve">2.1</w:t>
+            </w:r>
+          </w:p>
+        </w:tc>
+        <w:tc>
+          <w:tcPr>
+            <w:tcW w:type="dxa" w:w="1300"/>
+            <w:tcBorders>
+              <w:top w:val="single" w:color="auto" w:sz="4"/>
+              <w:left w:val="single" w:color="auto" w:sz="4"/>
+              <w:bottom w:val="single" w:color="auto" w:sz="4"/>
+              <w:right w:val="single" w:color="auto" w:sz="4"/>
+            </w:tcBorders>
+            <w:tcMar>
+              <w:top w:type="dxa" w:w="60"/>
+              <w:left w:type="dxa" w:w="110"/>
+              <w:bottom w:type="dxa" w:w="60"/>
+              <w:right w:type="dxa" w:w="110"/>
+            </w:tcMar>
+          </w:tcPr>
+          <w:p>
+            <w:pPr>
+              <w:spacing w:after="0" w:line="260"/>
+            </w:pPr>
+            <w:r>
+              <w:rPr>
+                <w:rFonts w:ascii="Calibri" w:cs="Calibri" w:eastAsia="Calibri" w:hAnsi="Calibri"/>
+                <w:b w:val="false"/>
+                <w:bCs w:val="false"/>
+                <w:color w:val="222222"/>
+                <w:sz w:val="19"/>
+                <w:szCs w:val="19"/>
+              </w:rPr>
+              <w:t xml:space="preserve">5 Oct 2026</w:t>
+            </w:r>
+          </w:p>
+        </w:tc>
+        <w:tc>
+          <w:tcPr>
+            <w:tcW w:type="dxa" w:w="7360"/>
+            <w:tcBorders>
+              <w:top w:val="single" w:color="auto" w:sz="4"/>
+              <w:left w:val="single" w:color="auto" w:sz="4"/>
+              <w:bottom w:val="single" w:color="auto" w:sz="4"/>
+              <w:right w:val="single" w:color="auto" w:sz="4"/>
+            </w:tcBorders>
+            <w:tcMar>
+              <w:top w:type="dxa" w:w="60"/>
+              <w:left w:type="dxa" w:w="110"/>
+              <w:bottom w:type="dxa" w:w="60"/>
+              <w:right w:type="dxa" w:w="110"/>
+            </w:tcMar>
+          </w:tcPr>
+          <w:p>
+            <w:pPr>
+              <w:spacing w:after="0" w:line="260"/>
+            </w:pPr>
+            <w:r>
+              <w:rPr>
+                <w:rFonts w:ascii="Calibri" w:cs="Calibri" w:eastAsia="Calibri" w:hAnsi="Calibri"/>
+                <w:b w:val="false"/>
+                <w:bCs w:val="false"/>
+                <w:color w:val="222222"/>
+                <w:sz w:val="19"/>
+                <w:szCs w:val="19"/>
+              </w:rPr>
+              <w:t xml:space="preserve">Released. Everything since 2.0, which is the revision customers hold. Aligned with SL-EULA-0004 (one acceptance screen on first launch; a customer-hosted install holds no project data, accounts, sign-in events or AI requests at Safety Lab). New section 4.5, the all-in-one option: the database, the sign-in service, the API, the live-update channel and the AI service on one computer the customer owns, installed by one script that needs only Docker, written step by step. The setup file: the install hands every user one file that configures the desktop, loads the license and trusts the server's certificate in one click; no user installs a certificate and IT needs no certificate authority. Section 3 says where every piece comes from, with the download address of the install package. Section 5.3 points at the setup file. Sections 7.2 and 7.3 rewritten for the two-part egress listing (addresses that carry project data and addresses that do not). Section 4.2 documents ALLOWED_ORIGINS; section 6.2 says to create the Anthropic key inside a Workspace. Section 2 names the subprocessor list and the incident process. Setting up the administrator follows the kit of 3 October: on a Supabase project of your own you create and confirm your account before naming it administrator (section 4.1); the all-in-one script creates the administrator account itself, asks for an optional mail server, and without one the administrator adds each user with add-user.sh (section 4.5). The install kit gained the sign-up trigger, the chain-check wrappers, private live-update channels, hardened access rules and lighter version history; an install built from an earlier kit must apply those files, in their numbered order. The server may be addressed by a fixed IP address as well as by a name: the install makes its certificate for the address, and section 4.5 says the address must be static or reserved because the certificate, the license and every setup file are tied to it. On Ubuntu 22.04 or later the install script installs Docker itself. Section 4.5 recommends an Ubuntu server or virtual machine with 16 GB of memory and 50 GB of disk, and names the downloads the install needs (Docker Hub, and Ubuntu’s package servers for Docker).</w:t>
+            </w:r>
+          </w:p>
+        </w:tc>
+      </w:tr>
     </w:tbl>
     <w:p>
       <w:r>
@@ -1357,7 +1357,7 @@
           <w:sz w:val="19"/>
           <w:szCs w:val="19"/>
         </w:rPr>
-        <w:t xml:space="preserve">	12</w:t>
+        <w:t xml:space="preserve">	13</w:t>
       </w:r>
     </w:p>
     <w:p>
@@ -2786,7 +2786,7 @@
           <w:sz w:val="21"/>
           <w:szCs w:val="21"/>
         </w:rPr>
-        <w:t xml:space="preserve"> Only for the all-in-one option (section 4.5). Docker Desktop from https://www.docker.com/products/docker-desktop/ on Windows or Mac, Docker Engine from your Linux distribution on a server. It is the one program you install; everything else runs inside it.</w:t>
+        <w:t xml:space="preserve"> Only for the all-in-one option (section 4.5). On an Ubuntu 22.04 or later server the install script installs it for you. On Windows or Mac, Docker Desktop from https://www.docker.com/products/docker-desktop/; on another Linux server, Docker Engine and its compose plugin from your distribution. It is the one program needed; everything else runs inside it.</w:t>
       </w:r>
     </w:p>
     <w:p>
@@ -3651,7 +3651,7 @@
           <w:sz w:val="21"/>
           <w:szCs w:val="21"/>
         </w:rPr>
-        <w:t xml:space="preserve">Sections 4.1 to 4.4 assume a Supabase project in your own cloud account. This section is the other way: the database, the sign-in service, the API, the live-update channel and the AI service all run on one computer inside your building, inside Docker, with no cloud account at all. The only outside address it ever talks to is your AI provider, for drafting requests, and those never carry your project files. One script does the whole install, and it asks four questions. It is written below for someone who has never done this before; if you have, skim the headings.</w:t>
+        <w:t xml:space="preserve">Sections 4.1 to 4.4 assume a Supabase project in your own cloud account. This section is the other way: the database, the sign-in service, the API, the live-update channel and the AI service all run on one computer inside your building, inside Docker, with no cloud account at all. Once installed, the only outside address it talks to is your AI provider, for drafting requests, and those never carry your project files. One script does the whole install, and it asks a few questions. It is written below for someone who has never done this before; if you have, skim the headings.</w:t>
       </w:r>
     </w:p>
     <w:p>
@@ -3723,7 +3723,7 @@
           <w:sz w:val="21"/>
           <w:szCs w:val="21"/>
         </w:rPr>
-        <w:t xml:space="preserve"> It must stay switched on. Windows 10 or 11 Pro, a Mac, or a Linux server. At least 4 processor cores, 8 GB of memory and 30 GB of free disk.</w:t>
+        <w:t xml:space="preserve"> It must stay switched on. The simplest is an Ubuntu 22.04 or 24.04 server or virtual machine; Windows 10 or 11 Pro or a Mac also work. At least 4 processor cores, 16 GB of memory (8 GB is the minimum and runs tight) and 50 GB of free disk.</w:t>
       </w:r>
     </w:p>
     <w:p>
@@ -3744,16 +3744,16 @@
           <w:sz w:val="21"/>
           <w:szCs w:val="21"/>
         </w:rPr>
-        <w:t xml:space="preserve">Install Docker Desktop.</w:t>
-      </w:r>
-      <w:r>
-        <w:rPr>
-          <w:rFonts w:ascii="Calibri" w:cs="Calibri" w:eastAsia="Calibri" w:hAnsi="Calibri"/>
-          <w:color w:val="222222"/>
-          <w:sz w:val="21"/>
-          <w:szCs w:val="21"/>
-        </w:rPr>
-        <w:t xml:space="preserve"> Go to https://www.docker.com/products/docker-desktop/ and click Download. Run the installer and accept the defaults. When it asks to use WSL 2 on Windows, say yes. Restart if it asks.</w:t>
+        <w:t xml:space="preserve">Install Docker Desktop (Windows or Mac only).</w:t>
+      </w:r>
+      <w:r>
+        <w:rPr>
+          <w:rFonts w:ascii="Calibri" w:cs="Calibri" w:eastAsia="Calibri" w:hAnsi="Calibri"/>
+          <w:color w:val="222222"/>
+          <w:sz w:val="21"/>
+          <w:szCs w:val="21"/>
+        </w:rPr>
+        <w:t xml:space="preserve"> On Ubuntu skip this step and the next: the script installs Docker itself. Go to https://www.docker.com/products/docker-desktop/ and click Download. Run the installer and accept the defaults. When it asks to use WSL 2 on Windows, say yes. Restart if it asks.</w:t>
       </w:r>
     </w:p>
     <w:p>
@@ -3774,7 +3774,7 @@
           <w:sz w:val="21"/>
           <w:szCs w:val="21"/>
         </w:rPr>
-        <w:t xml:space="preserve">Open Docker Desktop once.</w:t>
+        <w:t xml:space="preserve">Open Docker Desktop once (Windows or Mac only).</w:t>
       </w:r>
       <w:r>
         <w:rPr>
@@ -3813,7 +3813,7 @@
           <w:sz w:val="21"/>
           <w:szCs w:val="21"/>
         </w:rPr>
-        <w:t xml:space="preserve"> for example safetylab.yourcompany.local. Your IT person does this in your DNS. Test from another computer: open a command window and type ping safetylab.yourcompany.local. It should answer.</w:t>
+        <w:t xml:space="preserve"> for example safetylab.yourcompany.local. Your IT person does this in your DNS. Test from another computer: open a command window and type ping safetylab.yourcompany.local. It should answer. No name? Use the computer’s IP address instead, for example 10.20.30.40. It must be fixed: ask IT to make it static or reserve it. The certificate, your license and every user’s setup file are tied to the name or address, so changing it later means a new license and a new setup file for everyone.</w:t>
       </w:r>
     </w:p>
     <w:p>
@@ -3873,7 +3873,7 @@
           <w:sz w:val="21"/>
           <w:szCs w:val="21"/>
         </w:rPr>
-        <w:t xml:space="preserve"> It shows a short message; that is fine. It is the only outside address the computer needs.</w:t>
+        <w:t xml:space="preserve"> It shows a short message; that is fine. Once installed, it is the only outside address the computer needs. During the install it also downloads the software, about 9 GB, from Docker Hub (hub.docker.com and its download servers) and, on Ubuntu, Docker itself from Ubuntu’s package servers. Ask IT to allow those for the install.</w:t>
       </w:r>
     </w:p>
     <w:p>
@@ -3898,7 +3898,7 @@
           <w:sz w:val="21"/>
           <w:szCs w:val="21"/>
         </w:rPr>
-        <w:t xml:space="preserve">The script makes one, and the desktop application trusts it for this server automatically through the setup file, so no user installs anything. If your IT would rather use a certificate from the company's own authority, have the two files (certificate and private key, PEM) ready and give them when the script asks; everything else is the same.</w:t>
+        <w:t xml:space="preserve">The script makes one, and the desktop application trusts it for this server automatically through the setup file, so no user installs anything. If your IT would rather use a certificate from the company's own authority, have the two files (certificate and private key, PEM) ready and give them when the script asks; everything else is the same. With an IP address, use the script’s own certificate.</w:t>
       </w:r>
     </w:p>
     <w:p>
@@ -3945,7 +3945,7 @@
           <w:sz w:val="21"/>
           <w:szCs w:val="21"/>
         </w:rPr>
-        <w:t xml:space="preserve"> (section 3) into C:\SafetyLab on Windows, or your home folder on a Mac or Linux. You get a folder named customer-install. If Safety Lab sent the package after you told them the server name, your license file is already inside it.</w:t>
+        <w:t xml:space="preserve"> (section 3) into C:\SafetyLab on Windows, or your home folder on a Mac or Linux. You get a folder named customer-install. If Safety Lab sent the package after you told them the server name or IP address, your license file is already inside it.</w:t>
       </w:r>
     </w:p>
     <w:p>
@@ -4043,7 +4043,7 @@
           <w:sz w:val="21"/>
           <w:szCs w:val="21"/>
         </w:rPr>
-        <w:t xml:space="preserve"> pressing Enter after each: the server name from Part 1 step 4; press Enter twice at the certificate questions (unless IT gave you files); the AI key from step 5 (nothing shows while you type, which is normal); press Enter at the Workspace ID question unless Safety Lab told you otherwise; the administrator’s email address (yours, if you look after this server); then your mail server’s name, port, user name, password and sender address if IT gave you those, or press Enter to skip if you have no mail server (Part 4 explains what that changes).</w:t>
+        <w:t xml:space="preserve"> pressing Enter after each: the server name or IP address from Part 1 step 4; press Enter twice at the certificate questions (unless IT gave you files); the AI key from step 5 (nothing shows while you type, which is normal); press Enter at the Workspace ID question unless Safety Lab told you otherwise; the administrator’s email address (yours, if you look after this server); then your mail server’s name, port, user name, password and sender address if IT gave you those, or press Enter to skip if you have no mail server (Part 4 explains what that changes).</w:t>
       </w:r>
     </w:p>
     <w:p>
@@ -4327,7 +4327,7 @@
           <w:sz w:val="21"/>
           <w:szCs w:val="21"/>
         </w:rPr>
-        <w:t xml:space="preserve">In the stack folder: docker compose ps. Every line should say healthy or Up. Stop: docker compose stop. Start: docker compose start. After a reboot it starts by itself as long as Docker Desktop starts.</w:t>
+        <w:t xml:space="preserve">In the stack folder: docker compose ps. Every line should say healthy or Up. Stop: docker compose stop. Start: docker compose start. After a reboot it starts by itself as long as Docker starts (Docker Desktop on Windows or a Mac; on Ubuntu, Docker starts with the machine).</w:t>
       </w:r>
     </w:p>
     <w:p>

</xml_diff>

<commit_message>
VMware appliance: one .ova with everything inside, nothing downloaded at install (guide 2.1, section 4.6)
- customer-install/appliance: recipe for an Ubuntu VM holding Docker and all 13 service images,
  VMware disk controller and network adapter, a four-question first-boot setup and a
  maintenance menu
- setup retries install.sh up to three times when a service is only slow to come up
- install.sh offline mode (SLAB_OFFLINE=1) loads the images it was given and never pulls
- guide Rev 2.1: new section 4.6 for IT, contents page and history updated
- tests/regression_vmware_appliance_20261005: 40 checks
Wall: 376 suites, 0 fails.

Co-Authored-By: Claude Opus 5.5 <noreply@anthropic.com>
Claude-Session: https://claude.ai/code/session_01DmF5BU5HncUk9eoV6tcALT
</commit_message>
<xml_diff>
--- a/customer-install/SL-DG-0001 Deployment and Setup Guide v2.1.docx
+++ b/customer-install/SL-DG-0001 Deployment and Setup Guide v2.1.docx
@@ -926,7 +926,7 @@
                 <w:sz w:val="19"/>
                 <w:szCs w:val="19"/>
               </w:rPr>
-              <w:t xml:space="preserve">Released. Everything since 2.0, which is the revision customers hold. Aligned with SL-EULA-0004 (one acceptance screen on first launch; a customer-hosted install holds no project data, accounts, sign-in events or AI requests at Safety Lab). New section 4.5, the all-in-one option: the database, the sign-in service, the API, the live-update channel and the AI service on one computer the customer owns, installed by one script that needs only Docker, written step by step. The setup file: the install hands every user one file that configures the desktop, loads the license and trusts the server's certificate in one click; no user installs a certificate and IT needs no certificate authority. Section 3 says where every piece comes from, with the download address of the install package. Section 5.3 points at the setup file. Sections 7.2 and 7.3 rewritten for the two-part egress listing (addresses that carry project data and addresses that do not). Section 4.2 documents ALLOWED_ORIGINS; section 6.2 says to create the Anthropic key inside a Workspace. Section 2 names the subprocessor list and the incident process. Setting up the administrator follows the kit of 3 October: on a Supabase project of your own you create and confirm your account before naming it administrator (section 4.1); the all-in-one script creates the administrator account itself, asks for an optional mail server, and without one the administrator adds each user with add-user.sh (section 4.5). The install kit gained the sign-up trigger, the chain-check wrappers, private live-update channels, hardened access rules and lighter version history; an install built from an earlier kit must apply those files, in their numbered order. The server may be addressed by a fixed IP address as well as by a name: the install makes its certificate for the address, and section 4.5 says the address must be static or reserved because the certificate, the license and every setup file are tied to it. On Ubuntu 22.04 or later the install script installs Docker itself. Section 4.5 recommends an Ubuntu server or virtual machine with 16 GB of memory and 50 GB of disk, and names the downloads the install needs (Docker Hub, and Ubuntu’s package servers for Docker).</w:t>
+              <w:t xml:space="preserve">Released. Everything since 2.0, which is the revision customers hold. Aligned with SL-EULA-0004 (one acceptance screen on first launch; a customer-hosted install holds no project data, accounts, sign-in events or AI requests at Safety Lab). New section 4.5, the all-in-one option: the database, the sign-in service, the API, the live-update channel and the AI service on one computer the customer owns, installed by one script that needs only Docker, written step by step. The setup file: the install hands every user one file that configures the desktop, loads the license and trusts the server's certificate in one click; no user installs a certificate and IT needs no certificate authority. Section 3 says where every piece comes from, with the download address of the install package. Section 5.3 points at the setup file. Sections 7.2 and 7.3 rewritten for the two-part egress listing (addresses that carry project data and addresses that do not). Section 4.2 documents ALLOWED_ORIGINS; section 6.2 says to create the Anthropic key inside a Workspace. Section 2 names the subprocessor list and the incident process. Setting up the administrator follows the kit of 3 October: on a Supabase project of your own you create and confirm your account before naming it administrator (section 4.1); the all-in-one script creates the administrator account itself, asks for an optional mail server, and without one the administrator adds each user with add-user.sh (section 4.5). The install kit gained the sign-up trigger, the chain-check wrappers, private live-update channels, hardened access rules and lighter version history; an install built from an earlier kit must apply those files, in their numbered order. The server may be addressed by a fixed IP address as well as by a name: the install makes its certificate for the address, and section 4.5 says the address must be static or reserved because the certificate, the license and every setup file are tied to it. On Ubuntu 22.04 or later the install script installs Docker itself. Section 4.5 recommends an Ubuntu server or virtual machine with 16 GB of memory and 50 GB of disk, and names the downloads the install needs (Docker Hub, and Ubuntu’s package servers for Docker). New section 4.6: the VMware appliance, one file to import with everything inside and nothing downloaded during the install.</w:t>
             </w:r>
           </w:p>
         </w:tc>
@@ -1221,6 +1221,35 @@
           <w:tab w:val="right" w:pos="9360" w:leader="dot"/>
         </w:tabs>
         <w:spacing w:after="40" w:line="260"/>
+        <w:ind w:left="420"/>
+      </w:pPr>
+      <w:r>
+        <w:rPr>
+          <w:rFonts w:ascii="Calibri" w:cs="Calibri" w:eastAsia="Calibri" w:hAnsi="Calibri"/>
+          <w:b w:val="false"/>
+          <w:bCs w:val="false"/>
+          <w:color w:val="222222"/>
+          <w:sz w:val="19"/>
+          <w:szCs w:val="19"/>
+        </w:rPr>
+        <w:t xml:space="preserve">4.6 The VMware appliance: import one file</w:t>
+      </w:r>
+      <w:r>
+        <w:rPr>
+          <w:rFonts w:ascii="Calibri" w:cs="Calibri" w:eastAsia="Calibri" w:hAnsi="Calibri"/>
+          <w:color w:val="222222"/>
+          <w:sz w:val="19"/>
+          <w:szCs w:val="19"/>
+        </w:rPr>
+        <w:t xml:space="preserve">	11</w:t>
+      </w:r>
+    </w:p>
+    <w:p>
+      <w:pPr>
+        <w:tabs>
+          <w:tab w:val="right" w:pos="9360" w:leader="dot"/>
+        </w:tabs>
+        <w:spacing w:after="40" w:line="260"/>
         <w:ind w:left="0"/>
       </w:pPr>
       <w:r>
@@ -1241,7 +1270,7 @@
           <w:sz w:val="19"/>
           <w:szCs w:val="19"/>
         </w:rPr>
-        <w:t xml:space="preserve">	11</w:t>
+        <w:t xml:space="preserve">	12</w:t>
       </w:r>
     </w:p>
     <w:p>
@@ -1270,7 +1299,7 @@
           <w:sz w:val="19"/>
           <w:szCs w:val="19"/>
         </w:rPr>
-        <w:t xml:space="preserve">	11</w:t>
+        <w:t xml:space="preserve">	12</w:t>
       </w:r>
     </w:p>
     <w:p>
@@ -1299,7 +1328,7 @@
           <w:sz w:val="19"/>
           <w:szCs w:val="19"/>
         </w:rPr>
-        <w:t xml:space="preserve">	11</w:t>
+        <w:t xml:space="preserve">	12</w:t>
       </w:r>
     </w:p>
     <w:p>
@@ -1328,7 +1357,7 @@
           <w:sz w:val="19"/>
           <w:szCs w:val="19"/>
         </w:rPr>
-        <w:t xml:space="preserve">	12</w:t>
+        <w:t xml:space="preserve">	13</w:t>
       </w:r>
     </w:p>
     <w:p>
@@ -1386,7 +1415,7 @@
           <w:sz w:val="19"/>
           <w:szCs w:val="19"/>
         </w:rPr>
-        <w:t xml:space="preserve">	13</w:t>
+        <w:t xml:space="preserve">	14</w:t>
       </w:r>
     </w:p>
     <w:p>
@@ -1415,7 +1444,7 @@
           <w:sz w:val="19"/>
           <w:szCs w:val="19"/>
         </w:rPr>
-        <w:t xml:space="preserve">	14</w:t>
+        <w:t xml:space="preserve">	15</w:t>
       </w:r>
     </w:p>
     <w:p>
@@ -1444,7 +1473,7 @@
           <w:sz w:val="19"/>
           <w:szCs w:val="19"/>
         </w:rPr>
-        <w:t xml:space="preserve">	14</w:t>
+        <w:t xml:space="preserve">	15</w:t>
       </w:r>
     </w:p>
     <w:p>
@@ -1473,7 +1502,7 @@
           <w:sz w:val="19"/>
           <w:szCs w:val="19"/>
         </w:rPr>
-        <w:t xml:space="preserve">	14</w:t>
+        <w:t xml:space="preserve">	15</w:t>
       </w:r>
     </w:p>
     <w:p>
@@ -1502,7 +1531,7 @@
           <w:sz w:val="19"/>
           <w:szCs w:val="19"/>
         </w:rPr>
-        <w:t xml:space="preserve">	14</w:t>
+        <w:t xml:space="preserve">	15</w:t>
       </w:r>
     </w:p>
     <w:p>
@@ -1531,7 +1560,7 @@
           <w:sz w:val="19"/>
           <w:szCs w:val="19"/>
         </w:rPr>
-        <w:t xml:space="preserve">	15</w:t>
+        <w:t xml:space="preserve">	16</w:t>
       </w:r>
     </w:p>
     <w:p>
@@ -1560,7 +1589,7 @@
           <w:sz w:val="19"/>
           <w:szCs w:val="19"/>
         </w:rPr>
-        <w:t xml:space="preserve">	16</w:t>
+        <w:t xml:space="preserve">	17</w:t>
       </w:r>
     </w:p>
     <w:p>
@@ -1589,7 +1618,7 @@
           <w:sz w:val="19"/>
           <w:szCs w:val="19"/>
         </w:rPr>
-        <w:t xml:space="preserve">	16</w:t>
+        <w:t xml:space="preserve">	17</w:t>
       </w:r>
     </w:p>
     <w:p>
@@ -1618,7 +1647,7 @@
           <w:sz w:val="19"/>
           <w:szCs w:val="19"/>
         </w:rPr>
-        <w:t xml:space="preserve">	16</w:t>
+        <w:t xml:space="preserve">	17</w:t>
       </w:r>
     </w:p>
     <w:p>
@@ -1647,7 +1676,7 @@
           <w:sz w:val="19"/>
           <w:szCs w:val="19"/>
         </w:rPr>
-        <w:t xml:space="preserve">	16</w:t>
+        <w:t xml:space="preserve">	17</w:t>
       </w:r>
     </w:p>
     <w:p>
@@ -1676,7 +1705,7 @@
           <w:sz w:val="19"/>
           <w:szCs w:val="19"/>
         </w:rPr>
-        <w:t xml:space="preserve">	16</w:t>
+        <w:t xml:space="preserve">	17</w:t>
       </w:r>
     </w:p>
     <w:p>
@@ -2726,7 +2755,7 @@
           <w:sz w:val="21"/>
           <w:szCs w:val="21"/>
         </w:rPr>
-        <w:t xml:space="preserve">. It holds the database kit, the AI proxy, the all-in-one installer of section 4.5 and the setup tools. It contains no secrets and nothing of yours; everything personal is generated on your machine when you run it.</w:t>
+        <w:t xml:space="preserve">. It holds the database kit, the AI proxy, the all-in-one installer of section 4.5 and the setup tools. It contains no secrets and nothing of yours; everything personal is generated on your machine when you run it. On VMware, Safety Lab can instead send the appliance of section 4.6: one file with everything already inside.</w:t>
       </w:r>
     </w:p>
     <w:p>
@@ -4378,6 +4407,266 @@
           <w:szCs w:val="21"/>
         </w:rPr>
         <w:t xml:space="preserve">Database updates arrive as new numbered files for the db folder; copy them in and apply each new one in order with the command in the package README. A new package version is unzipped over the old one, keeping selfhost/stack and selfhost/answers.env, and bash install.sh is run again.</w:t>
+      </w:r>
+    </w:p>
+    <w:p>
+      <w:pPr>
+        <w:pStyle w:val="Heading2"/>
+        <w:spacing w:after="110" w:before="260"/>
+      </w:pPr>
+      <w:r>
+        <w:rPr>
+          <w:rFonts w:ascii="Calibri" w:cs="Calibri" w:eastAsia="Calibri" w:hAnsi="Calibri"/>
+          <w:b/>
+          <w:bCs/>
+          <w:color w:val="1F3A5F"/>
+          <w:sz w:val="26"/>
+          <w:szCs w:val="26"/>
+        </w:rPr>
+        <w:t xml:space="preserve">4.6 The VMware appliance: import one file</w:t>
+      </w:r>
+    </w:p>
+    <w:p>
+      <w:pPr>
+        <w:spacing w:after="150" w:line="276"/>
+      </w:pPr>
+      <w:r>
+        <w:rPr>
+          <w:rFonts w:ascii="Calibri" w:cs="Calibri" w:eastAsia="Calibri" w:hAnsi="Calibri"/>
+          <w:color w:val="222222"/>
+          <w:sz w:val="21"/>
+          <w:szCs w:val="21"/>
+        </w:rPr>
+        <w:t xml:space="preserve">The quickest way to run the all-in-one option of section 4.5 on VMware. Safety Lab sends one file (an .ova of about 1.7 GB) that already holds everything: Ubuntu, Docker and every part of Safety Lab Aero. Nothing is downloaded during the install, so it works behind a closed firewall. Once running, the only outside address it uses is your AI provider, for drafting requests.</w:t>
+      </w:r>
+    </w:p>
+    <w:p>
+      <w:pPr>
+        <w:pStyle w:val="Heading3"/>
+        <w:spacing w:after="90" w:before="200"/>
+      </w:pPr>
+      <w:r>
+        <w:rPr>
+          <w:rFonts w:ascii="Calibri" w:cs="Calibri" w:eastAsia="Calibri" w:hAnsi="Calibri"/>
+          <w:b/>
+          <w:bCs/>
+          <w:color w:val="1F3A5F"/>
+          <w:sz w:val="23"/>
+          <w:szCs w:val="23"/>
+        </w:rPr>
+        <w:t xml:space="preserve">What IT does (about 15 minutes, then 10 minutes of waiting)</w:t>
+      </w:r>
+    </w:p>
+    <w:p>
+      <w:pPr>
+        <w:pStyle w:val="ListParagraph"/>
+        <w:numPr>
+          <w:ilvl w:val="0"/>
+          <w:numId w:val="11"/>
+        </w:numPr>
+        <w:spacing w:after="90" w:line="276"/>
+      </w:pPr>
+      <w:r>
+        <w:rPr>
+          <w:rFonts w:ascii="Calibri" w:cs="Calibri" w:eastAsia="Calibri" w:hAnsi="Calibri"/>
+          <w:b/>
+          <w:bCs/>
+          <w:color w:val="222222"/>
+          <w:sz w:val="21"/>
+          <w:szCs w:val="21"/>
+        </w:rPr>
+        <w:t xml:space="preserve">Import the file.</w:t>
+      </w:r>
+      <w:r>
+        <w:rPr>
+          <w:rFonts w:ascii="Calibri" w:cs="Calibri" w:eastAsia="Calibri" w:hAnsi="Calibri"/>
+          <w:color w:val="222222"/>
+          <w:sz w:val="21"/>
+          <w:szCs w:val="21"/>
+        </w:rPr>
+        <w:t xml:space="preserve"> In vSphere, right-click a host or cluster, choose Deploy OVF Template, pick the .ova and follow the wizard: name, location, storage (thin provisioned is fine) and the network the engineers’ laptops can reach. It comes set to 4 processors, 16 GB of memory and a 60 GB disk; keep those or raise them.</w:t>
+      </w:r>
+    </w:p>
+    <w:p>
+      <w:pPr>
+        <w:pStyle w:val="ListParagraph"/>
+        <w:numPr>
+          <w:ilvl w:val="0"/>
+          <w:numId w:val="11"/>
+        </w:numPr>
+        <w:spacing w:after="90" w:line="276"/>
+      </w:pPr>
+      <w:r>
+        <w:rPr>
+          <w:rFonts w:ascii="Calibri" w:cs="Calibri" w:eastAsia="Calibri" w:hAnsi="Calibri"/>
+          <w:b/>
+          <w:bCs/>
+          <w:color w:val="222222"/>
+          <w:sz w:val="21"/>
+          <w:szCs w:val="21"/>
+        </w:rPr>
+        <w:t xml:space="preserve">Decide its fixed address.</w:t>
+      </w:r>
+      <w:r>
+        <w:rPr>
+          <w:rFonts w:ascii="Calibri" w:cs="Calibri" w:eastAsia="Calibri" w:hAnsi="Calibri"/>
+          <w:color w:val="222222"/>
+          <w:sz w:val="21"/>
+          <w:szCs w:val="21"/>
+        </w:rPr>
+        <w:t xml:space="preserve"> Either reserve the address your network gives it (a DHCP reservation), or have an IP address, prefix length, gateway and DNS server ready to type in. The address must never change: the license, the certificate and every user’s setup file are tied to it.</w:t>
+      </w:r>
+    </w:p>
+    <w:p>
+      <w:pPr>
+        <w:pStyle w:val="ListParagraph"/>
+        <w:numPr>
+          <w:ilvl w:val="0"/>
+          <w:numId w:val="11"/>
+        </w:numPr>
+        <w:spacing w:after="90" w:line="276"/>
+      </w:pPr>
+      <w:r>
+        <w:rPr>
+          <w:rFonts w:ascii="Calibri" w:cs="Calibri" w:eastAsia="Calibri" w:hAnsi="Calibri"/>
+          <w:b/>
+          <w:bCs/>
+          <w:color w:val="222222"/>
+          <w:sz w:val="21"/>
+          <w:szCs w:val="21"/>
+        </w:rPr>
+        <w:t xml:space="preserve">Power it on and open its console.</w:t>
+      </w:r>
+      <w:r>
+        <w:rPr>
+          <w:rFonts w:ascii="Calibri" w:cs="Calibri" w:eastAsia="Calibri" w:hAnsi="Calibri"/>
+          <w:color w:val="222222"/>
+          <w:sz w:val="21"/>
+          <w:szCs w:val="21"/>
+        </w:rPr>
+        <w:t xml:space="preserve"> A blue setup screen appears.</w:t>
+      </w:r>
+    </w:p>
+    <w:p>
+      <w:pPr>
+        <w:pStyle w:val="ListParagraph"/>
+        <w:numPr>
+          <w:ilvl w:val="0"/>
+          <w:numId w:val="11"/>
+        </w:numPr>
+        <w:spacing w:after="90" w:line="276"/>
+      </w:pPr>
+      <w:r>
+        <w:rPr>
+          <w:rFonts w:ascii="Calibri" w:cs="Calibri" w:eastAsia="Calibri" w:hAnsi="Calibri"/>
+          <w:b/>
+          <w:bCs/>
+          <w:color w:val="222222"/>
+          <w:sz w:val="21"/>
+          <w:szCs w:val="21"/>
+        </w:rPr>
+        <w:t xml:space="preserve">Answer four questions:</w:t>
+      </w:r>
+      <w:r>
+        <w:rPr>
+          <w:rFonts w:ascii="Calibri" w:cs="Calibri" w:eastAsia="Calibri" w:hAnsi="Calibri"/>
+          <w:color w:val="222222"/>
+          <w:sz w:val="21"/>
+          <w:szCs w:val="21"/>
+        </w:rPr>
+        <w:t xml:space="preserve"> a password for the maintenance login (user name safetylab); the address (keep the one shown if IT reserved it, or type the fixed one); the administrator’s email; and the Anthropic API key. Whoever made the key can type it in themselves. It stays on this machine.</w:t>
+      </w:r>
+    </w:p>
+    <w:p>
+      <w:pPr>
+        <w:pStyle w:val="ListParagraph"/>
+        <w:numPr>
+          <w:ilvl w:val="0"/>
+          <w:numId w:val="11"/>
+        </w:numPr>
+        <w:spacing w:after="90" w:line="276"/>
+      </w:pPr>
+      <w:r>
+        <w:rPr>
+          <w:rFonts w:ascii="Calibri" w:cs="Calibri" w:eastAsia="Calibri" w:hAnsi="Calibri"/>
+          <w:b/>
+          <w:bCs/>
+          <w:color w:val="222222"/>
+          <w:sz w:val="21"/>
+          <w:szCs w:val="21"/>
+        </w:rPr>
+        <w:t xml:space="preserve">Wait about ten minutes.</w:t>
+      </w:r>
+      <w:r>
+        <w:rPr>
+          <w:rFonts w:ascii="Calibri" w:cs="Calibri" w:eastAsia="Calibri" w:hAnsi="Calibri"/>
+          <w:color w:val="222222"/>
+          <w:sz w:val="21"/>
+          <w:szCs w:val="21"/>
+        </w:rPr>
+        <w:t xml:space="preserve"> The last screen shows the administrator’s temporary password once (write it down), the address users connect to, and where they get the setup file.</w:t>
+      </w:r>
+    </w:p>
+    <w:p>
+      <w:pPr>
+        <w:pStyle w:val="Heading3"/>
+        <w:spacing w:after="90" w:before="200"/>
+      </w:pPr>
+      <w:r>
+        <w:rPr>
+          <w:rFonts w:ascii="Calibri" w:cs="Calibri" w:eastAsia="Calibri" w:hAnsi="Calibri"/>
+          <w:b/>
+          <w:bCs/>
+          <w:color w:val="1F3A5F"/>
+          <w:sz w:val="23"/>
+          <w:szCs w:val="23"/>
+        </w:rPr>
+        <w:t xml:space="preserve">Every user (two minutes each)</w:t>
+      </w:r>
+    </w:p>
+    <w:p>
+      <w:pPr>
+        <w:spacing w:after="150" w:line="276"/>
+      </w:pPr>
+      <w:r>
+        <w:rPr>
+          <w:rFonts w:ascii="Calibri" w:cs="Calibri" w:eastAsia="Calibri" w:hAnsi="Calibri"/>
+          <w:color w:val="222222"/>
+          <w:sz w:val="21"/>
+          <w:szCs w:val="21"/>
+        </w:rPr>
+        <w:t xml:space="preserve">Install the desktop application from https://safetylabaero.com. Then, in a browser, download the setup file from https://&lt;the address&gt;/safetylab-setup and open it in the application with Choose setup file. The browser warns once that it does not know the server’s certificate; that is expected, and the fingerprint it shows should match the one on the console’s last screen. Load the license file Safety Lab sent when the application asks for it, then sign in with the email and temporary password the administrator gives you.</w:t>
+      </w:r>
+    </w:p>
+    <w:p>
+      <w:pPr>
+        <w:pStyle w:val="Heading3"/>
+        <w:spacing w:after="90" w:before="200"/>
+      </w:pPr>
+      <w:r>
+        <w:rPr>
+          <w:rFonts w:ascii="Calibri" w:cs="Calibri" w:eastAsia="Calibri" w:hAnsi="Calibri"/>
+          <w:b/>
+          <w:bCs/>
+          <w:color w:val="1F3A5F"/>
+          <w:sz w:val="23"/>
+          <w:szCs w:val="23"/>
+        </w:rPr>
+        <w:t xml:space="preserve">Looking after it</w:t>
+      </w:r>
+    </w:p>
+    <w:p>
+      <w:pPr>
+        <w:spacing w:after="150" w:line="276"/>
+      </w:pPr>
+      <w:r>
+        <w:rPr>
+          <w:rFonts w:ascii="Calibri" w:cs="Calibri" w:eastAsia="Calibri" w:hAnsi="Calibri"/>
+          <w:color w:val="222222"/>
+          <w:sz w:val="21"/>
+          <w:szCs w:val="21"/>
+        </w:rPr>
+        <w:t xml:space="preserve">Log in on the console, or over SSH, as safetylab. A menu offers: add a person (it prints a temporary password to give them), show the address and setup file, check or restart the services, and where the data and the keys are for backups. A VMware snapshot of the whole machine, taken with the services stopped, is also a full backup.</w:t>
       </w:r>
     </w:p>
     <w:p>
@@ -6138,6 +6427,12 @@
     </w:lvlOverride>
   </w:num>
   <w:num w:numId="10">
+    <w:abstractNumId w:val="3"/>
+    <w:lvlOverride w:ilvl="0">
+      <w:startOverride w:val="1"/>
+    </w:lvlOverride>
+  </w:num>
+  <w:num w:numId="11">
     <w:abstractNumId w:val="3"/>
     <w:lvlOverride w:ilvl="0">
       <w:startOverride w:val="1"/>

</xml_diff>

<commit_message>
SL-DG-0001 Rev 2.1, section 4.6: port 443 from the laptops, and the key's Workspace ID
Two things IT would otherwise hit on install day: the engineers' laptops (and the VPN) must reach
the server on port 443, and the setup screen asks for the Anthropic key's Workspace ID right after
the key. Stays Rev 2.1 (Waqas: update it at the same link). Contents page re-verified against the PDF.
Wall: 377 suites, 0 fails.

Co-Authored-By: Claude Opus 5.5 <noreply@anthropic.com>
Claude-Session: https://claude.ai/code/session_01DmF5BU5HncUk9eoV6tcALT
</commit_message>
<xml_diff>
--- a/customer-install/SL-DG-0001 Deployment and Setup Guide v2.1.docx
+++ b/customer-install/SL-DG-0001 Deployment and Setup Guide v2.1.docx
@@ -1386,7 +1386,7 @@
           <w:sz w:val="19"/>
           <w:szCs w:val="19"/>
         </w:rPr>
-        <w:t xml:space="preserve">	13</w:t>
+        <w:t xml:space="preserve">	14</w:t>
       </w:r>
     </w:p>
     <w:p>
@@ -4514,7 +4514,7 @@
           <w:sz w:val="21"/>
           <w:szCs w:val="21"/>
         </w:rPr>
-        <w:t xml:space="preserve"> Either reserve the address your network gives it (a DHCP reservation), or have an IP address, prefix length, gateway and DNS server ready to type in. The address must never change: the license, the certificate and every user’s setup file are tied to it.</w:t>
+        <w:t xml:space="preserve"> Either reserve the address your network gives it (a DHCP reservation), or have an IP address, prefix length, gateway and DNS server ready to type in. The address must never change: the license, the certificate and every user’s setup file are tied to it. Every engineer’s laptop, including over the VPN, must be able to reach that address on port 443 (HTTPS); it is the only port users need.</w:t>
       </w:r>
     </w:p>
     <w:p>
@@ -4574,7 +4574,7 @@
           <w:sz w:val="21"/>
           <w:szCs w:val="21"/>
         </w:rPr>
-        <w:t xml:space="preserve"> a password for the maintenance login (user name safetylab); the address (keep the one shown if IT reserved it, or type the fixed one); the administrator’s email; and the Anthropic API key. Whoever made the key can type it in themselves. It stays on this machine.</w:t>
+        <w:t xml:space="preserve"> a password for the maintenance login (user name safetylab); the address (keep the one shown if IT reserved it, or type the fixed one); the administrator’s email; and the Anthropic API key. Make the key inside a Workspace at console.anthropic.com and have that Workspace’s ID (it starts with wrkspc_) ready: the screen asks for it right after the key, and Anthropic refuses a key that is not tied to a Workspace. Whoever made the key can type both in themselves. The key stays on this machine.</w:t>
       </w:r>
     </w:p>
     <w:p>

</xml_diff>